<commit_message>
Add AWSRaid CloudTrail investigation
</commit_message>
<xml_diff>
--- a/CyberDefenders/AWSRaid/AWSRaid-CloudTrail-Investigation-Report.docx
+++ b/CyberDefenders/AWSRaid/AWSRaid-CloudTrail-Investigation-Report.docx
@@ -2399,6 +2399,133 @@
           <w:color w:val="5B6573"/>
           <w:sz w:val="16"/>
         </w:rPr>
+        <w:t>SPL — initial CloudTrail dataset</w:t>
+      </w:r>
+    </w:p>
+    <w:tbl>
+      <w:tblPr>
+        <w:tblW w:type="auto" w:w="0"/>
+        <w:jc w:val="center"/>
+        <w:tblLayout w:type="fixed"/>
+        <w:tblLook w:firstColumn="1" w:firstRow="1" w:lastColumn="0" w:lastRow="0" w:noHBand="0" w:noVBand="1" w:val="04A0"/>
+      </w:tblPr>
+      <w:tblGrid>
+        <w:gridCol w:w="10166"/>
+      </w:tblGrid>
+      <w:tr>
+        <w:tc>
+          <w:tcPr>
+            <w:tcW w:type="dxa" w:w="9864"/>
+            <w:shd w:fill="F2F4F7"/>
+            <w:tcMar>
+              <w:top w:w="90" w:type="dxa"/>
+              <w:start w:w="110" w:type="dxa"/>
+              <w:bottom w:w="90" w:type="dxa"/>
+              <w:end w:w="110" w:type="dxa"/>
+            </w:tcMar>
+            <w:tcBorders>
+              <w:top w:val="single" w:sz="4" w:color="B9C1CB"/>
+              <w:left w:val="single" w:sz="4" w:color="B9C1CB"/>
+              <w:bottom w:val="single" w:sz="4" w:color="B9C1CB"/>
+              <w:right w:val="single" w:sz="4" w:color="B9C1CB"/>
+            </w:tcBorders>
+          </w:tcPr>
+          <w:p>
+            <w:pPr>
+              <w:spacing w:after="0"/>
+            </w:pPr>
+            <w:r>
+              <w:rPr>
+                <w:rFonts w:ascii="DejaVu Sans Mono" w:hAnsi="DejaVu Sans Mono" w:eastAsia="DejaVu Sans Mono"/>
+                <w:b w:val="0"/>
+                <w:i w:val="0"/>
+                <w:color w:val="111111"/>
+                <w:sz w:val="15"/>
+              </w:rPr>
+              <w:t>index="aws_cloudtrail"</w:t>
+            </w:r>
+          </w:p>
+        </w:tc>
+      </w:tr>
+    </w:tbl>
+    <w:p>
+      <w:pPr>
+        <w:spacing w:after="0"/>
+      </w:pPr>
+    </w:p>
+    <w:p>
+      <w:pPr>
+        <w:spacing w:after="40"/>
+        <w:jc w:val="center"/>
+      </w:pPr>
+      <w:r>
+        <w:drawing>
+          <wp:inline xmlns:a="http://schemas.openxmlformats.org/drawingml/2006/main" xmlns:pic="http://schemas.openxmlformats.org/drawingml/2006/picture">
+            <wp:extent cx="6263640" cy="3172663"/>
+            <wp:docPr id="1" name="Picture 1" title="00-cloudtrail-overview.png" descr="Figure 1. Initial review of the 4,032 CloudTrail events in Splunk."/>
+            <wp:cNvGraphicFramePr>
+              <a:graphicFrameLocks noChangeAspect="1"/>
+            </wp:cNvGraphicFramePr>
+            <a:graphic>
+              <a:graphicData uri="http://schemas.openxmlformats.org/drawingml/2006/picture">
+                <pic:pic>
+                  <pic:nvPicPr>
+                    <pic:cNvPr id="0" name="00-cloudtrail-overview.png"/>
+                    <pic:cNvPicPr/>
+                  </pic:nvPicPr>
+                  <pic:blipFill>
+                    <a:blip r:embed="rId11"/>
+                    <a:stretch>
+                      <a:fillRect/>
+                    </a:stretch>
+                  </pic:blipFill>
+                  <pic:spPr>
+                    <a:xfrm>
+                      <a:off x="0" y="0"/>
+                      <a:ext cx="6263640" cy="3172663"/>
+                    </a:xfrm>
+                    <a:prstGeom prst="rect"/>
+                  </pic:spPr>
+                </pic:pic>
+              </a:graphicData>
+            </a:graphic>
+          </wp:inline>
+        </w:drawing>
+      </w:r>
+    </w:p>
+    <w:p>
+      <w:pPr>
+        <w:spacing w:after="120"/>
+        <w:jc w:val="center"/>
+        <w:keepLines/>
+        <w:widowControl/>
+      </w:pPr>
+      <w:r>
+        <w:rPr>
+          <w:rFonts w:ascii="Aptos" w:hAnsi="Aptos" w:eastAsia="Aptos"/>
+          <w:b w:val="0"/>
+          <w:i/>
+          <w:color w:val="5B6573"/>
+          <w:sz w:val="15"/>
+        </w:rPr>
+        <w:t>Figure 1. Initial review of the 4,032 CloudTrail events in Splunk.</w:t>
+      </w:r>
+    </w:p>
+    <w:p>
+      <w:pPr>
+        <w:spacing w:after="40"/>
+        <w:keepNext/>
+        <w:keepLines/>
+        <w:widowControl/>
+      </w:pPr>
+      <w:r>
+        <w:rPr>
+          <w:rFonts w:ascii="Aptos" w:hAnsi="Aptos" w:eastAsia="Aptos"/>
+          <w:b/>
+          <w:i w:val="0"/>
+          <w:color w:val="5B6573"/>
+          <w:sz w:val="16"/>
+        </w:rPr>
         <w:t>SPL — event volume by AWS service</w:t>
       </w:r>
     </w:p>
@@ -2488,7 +2615,7 @@
         <w:drawing>
           <wp:inline xmlns:a="http://schemas.openxmlformats.org/drawingml/2006/main" xmlns:pic="http://schemas.openxmlformats.org/drawingml/2006/picture">
             <wp:extent cx="6263640" cy="3179198"/>
-            <wp:docPr id="1" name="Picture 1" title="01-cloudtrail-event-sources.png" descr="Figure 1. CloudTrail events grouped by AWS event source."/>
+            <wp:docPr id="2" name="Picture 2" title="01-cloudtrail-event-sources.png" descr="Figure 2. CloudTrail events grouped by AWS event source."/>
             <wp:cNvGraphicFramePr>
               <a:graphicFrameLocks noChangeAspect="1"/>
             </wp:cNvGraphicFramePr>
@@ -2500,7 +2627,7 @@
                     <pic:cNvPicPr/>
                   </pic:nvPicPr>
                   <pic:blipFill>
-                    <a:blip r:embed="rId11"/>
+                    <a:blip r:embed="rId12"/>
                     <a:stretch>
                       <a:fillRect/>
                     </a:stretch>
@@ -2534,7 +2661,7 @@
           <w:color w:val="5B6573"/>
           <w:sz w:val="15"/>
         </w:rPr>
-        <w:t>Figure 1. CloudTrail events grouped by AWS event source.</w:t>
+        <w:t>Figure 2. CloudTrail events grouped by AWS event source.</w:t>
       </w:r>
     </w:p>
     <w:p>
@@ -2693,6 +2820,64 @@
     </w:p>
     <w:p>
       <w:pPr>
+        <w:spacing w:after="40"/>
+        <w:jc w:val="center"/>
+      </w:pPr>
+      <w:r>
+        <w:drawing>
+          <wp:inline xmlns:a="http://schemas.openxmlformats.org/drawingml/2006/main" xmlns:pic="http://schemas.openxmlformats.org/drawingml/2006/picture">
+            <wp:extent cx="6263640" cy="3172663"/>
+            <wp:docPr id="3" name="Picture 3" title="02-console-login-sequence.png" descr="Figure 3. Chronological authentication sequence showing failures followed by success."/>
+            <wp:cNvGraphicFramePr>
+              <a:graphicFrameLocks noChangeAspect="1"/>
+            </wp:cNvGraphicFramePr>
+            <a:graphic>
+              <a:graphicData uri="http://schemas.openxmlformats.org/drawingml/2006/picture">
+                <pic:pic>
+                  <pic:nvPicPr>
+                    <pic:cNvPr id="0" name="02-console-login-sequence.png"/>
+                    <pic:cNvPicPr/>
+                  </pic:nvPicPr>
+                  <pic:blipFill>
+                    <a:blip r:embed="rId13"/>
+                    <a:stretch>
+                      <a:fillRect/>
+                    </a:stretch>
+                  </pic:blipFill>
+                  <pic:spPr>
+                    <a:xfrm>
+                      <a:off x="0" y="0"/>
+                      <a:ext cx="6263640" cy="3172663"/>
+                    </a:xfrm>
+                    <a:prstGeom prst="rect"/>
+                  </pic:spPr>
+                </pic:pic>
+              </a:graphicData>
+            </a:graphic>
+          </wp:inline>
+        </w:drawing>
+      </w:r>
+    </w:p>
+    <w:p>
+      <w:pPr>
+        <w:spacing w:after="120"/>
+        <w:jc w:val="center"/>
+        <w:keepLines/>
+        <w:widowControl/>
+      </w:pPr>
+      <w:r>
+        <w:rPr>
+          <w:rFonts w:ascii="Aptos" w:hAnsi="Aptos" w:eastAsia="Aptos"/>
+          <w:b w:val="0"/>
+          <w:i/>
+          <w:color w:val="5B6573"/>
+          <w:sz w:val="15"/>
+        </w:rPr>
+        <w:t>Figure 3. Chronological authentication sequence showing failures followed by success.</w:t>
+      </w:r>
+    </w:p>
+    <w:p>
+      <w:pPr>
         <w:keepLines/>
         <w:widowControl/>
       </w:pPr>
@@ -2913,7 +3098,7 @@
         <w:drawing>
           <wp:inline xmlns:a="http://schemas.openxmlformats.org/drawingml/2006/main" xmlns:pic="http://schemas.openxmlformats.org/drawingml/2006/picture">
             <wp:extent cx="6263640" cy="3164511"/>
-            <wp:docPr id="2" name="Picture 2" title="02-failed-console-logins.png" descr="Figure 2. Failed console logins aggregated by user and source IP."/>
+            <wp:docPr id="4" name="Picture 4" title="03-failed-console-logins.png" descr="Figure 4. Failed console logins aggregated by user and source IP."/>
             <wp:cNvGraphicFramePr>
               <a:graphicFrameLocks noChangeAspect="1"/>
             </wp:cNvGraphicFramePr>
@@ -2921,11 +3106,11 @@
               <a:graphicData uri="http://schemas.openxmlformats.org/drawingml/2006/picture">
                 <pic:pic>
                   <pic:nvPicPr>
-                    <pic:cNvPr id="0" name="02-failed-console-logins.png"/>
+                    <pic:cNvPr id="0" name="03-failed-console-logins.png"/>
                     <pic:cNvPicPr/>
                   </pic:nvPicPr>
                   <pic:blipFill>
-                    <a:blip r:embed="rId12"/>
+                    <a:blip r:embed="rId14"/>
                     <a:stretch>
                       <a:fillRect/>
                     </a:stretch>
@@ -2959,7 +3144,7 @@
           <w:color w:val="5B6573"/>
           <w:sz w:val="15"/>
         </w:rPr>
-        <w:t>Figure 2. Failed console logins aggregated by user and source IP.</w:t>
+        <w:t>Figure 4. Failed console logins aggregated by user and source IP.</w:t>
       </w:r>
     </w:p>
     <w:p>
@@ -2976,64 +3161,6 @@
           <w:sz w:val="19"/>
         </w:rPr>
         <w:t>The largest cluster consisted of nine failed attempts against helpdesk.luke from 185.192.70.84 between 09:53:27 and 09:54:00 UTC. The next event for the same identity and source was a successful ConsoleLogin at 09:54:04 UTC.</w:t>
-      </w:r>
-    </w:p>
-    <w:p>
-      <w:pPr>
-        <w:spacing w:after="40"/>
-        <w:jc w:val="center"/>
-      </w:pPr>
-      <w:r>
-        <w:drawing>
-          <wp:inline xmlns:a="http://schemas.openxmlformats.org/drawingml/2006/main" xmlns:pic="http://schemas.openxmlformats.org/drawingml/2006/picture">
-            <wp:extent cx="6263640" cy="3172663"/>
-            <wp:docPr id="3" name="Picture 3" title="02b-console-login-sequence.png" descr="Figure 3. Authentication sequence showing failures followed by a successful login."/>
-            <wp:cNvGraphicFramePr>
-              <a:graphicFrameLocks noChangeAspect="1"/>
-            </wp:cNvGraphicFramePr>
-            <a:graphic>
-              <a:graphicData uri="http://schemas.openxmlformats.org/drawingml/2006/picture">
-                <pic:pic>
-                  <pic:nvPicPr>
-                    <pic:cNvPr id="0" name="02b-console-login-sequence.png"/>
-                    <pic:cNvPicPr/>
-                  </pic:nvPicPr>
-                  <pic:blipFill>
-                    <a:blip r:embed="rId13"/>
-                    <a:stretch>
-                      <a:fillRect/>
-                    </a:stretch>
-                  </pic:blipFill>
-                  <pic:spPr>
-                    <a:xfrm>
-                      <a:off x="0" y="0"/>
-                      <a:ext cx="6263640" cy="3172663"/>
-                    </a:xfrm>
-                    <a:prstGeom prst="rect"/>
-                  </pic:spPr>
-                </pic:pic>
-              </a:graphicData>
-            </a:graphic>
-          </wp:inline>
-        </w:drawing>
-      </w:r>
-    </w:p>
-    <w:p>
-      <w:pPr>
-        <w:spacing w:after="120"/>
-        <w:jc w:val="center"/>
-        <w:keepLines/>
-        <w:widowControl/>
-      </w:pPr>
-      <w:r>
-        <w:rPr>
-          <w:rFonts w:ascii="Aptos" w:hAnsi="Aptos" w:eastAsia="Aptos"/>
-          <w:b w:val="0"/>
-          <w:i/>
-          <w:color w:val="5B6573"/>
-          <w:sz w:val="15"/>
-        </w:rPr>
-        <w:t>Figure 3. Authentication sequence showing failures followed by a successful login.</w:t>
       </w:r>
     </w:p>
     <w:tbl>
@@ -3729,6 +3856,64 @@
       <w:pPr>
         <w:spacing w:after="0"/>
       </w:pPr>
+    </w:p>
+    <w:p>
+      <w:pPr>
+        <w:spacing w:after="40"/>
+        <w:jc w:val="center"/>
+      </w:pPr>
+      <w:r>
+        <w:drawing>
+          <wp:inline xmlns:a="http://schemas.openxmlformats.org/drawingml/2006/main" xmlns:pic="http://schemas.openxmlformats.org/drawingml/2006/picture">
+            <wp:extent cx="6263640" cy="3159593"/>
+            <wp:docPr id="5" name="Picture 5" title="04-compromised-user-activity.png" descr="Figure 5. The 480 events associated with the suspicious IP or compromised identity."/>
+            <wp:cNvGraphicFramePr>
+              <a:graphicFrameLocks noChangeAspect="1"/>
+            </wp:cNvGraphicFramePr>
+            <a:graphic>
+              <a:graphicData uri="http://schemas.openxmlformats.org/drawingml/2006/picture">
+                <pic:pic>
+                  <pic:nvPicPr>
+                    <pic:cNvPr id="0" name="04-compromised-user-activity.png"/>
+                    <pic:cNvPicPr/>
+                  </pic:nvPicPr>
+                  <pic:blipFill>
+                    <a:blip r:embed="rId15"/>
+                    <a:stretch>
+                      <a:fillRect/>
+                    </a:stretch>
+                  </pic:blipFill>
+                  <pic:spPr>
+                    <a:xfrm>
+                      <a:off x="0" y="0"/>
+                      <a:ext cx="6263640" cy="3159593"/>
+                    </a:xfrm>
+                    <a:prstGeom prst="rect"/>
+                  </pic:spPr>
+                </pic:pic>
+              </a:graphicData>
+            </a:graphic>
+          </wp:inline>
+        </w:drawing>
+      </w:r>
+    </w:p>
+    <w:p>
+      <w:pPr>
+        <w:spacing w:after="120"/>
+        <w:jc w:val="center"/>
+        <w:keepLines/>
+        <w:widowControl/>
+      </w:pPr>
+      <w:r>
+        <w:rPr>
+          <w:rFonts w:ascii="Aptos" w:hAnsi="Aptos" w:eastAsia="Aptos"/>
+          <w:b w:val="0"/>
+          <w:i/>
+          <w:color w:val="5B6573"/>
+          <w:sz w:val="15"/>
+        </w:rPr>
+        <w:t>Figure 5. The 480 events associated with the suspicious IP or compromised identity.</w:t>
+      </w:r>
     </w:p>
     <w:p>
       <w:pPr>
@@ -3993,7 +4178,7 @@
         <w:drawing>
           <wp:inline xmlns:a="http://schemas.openxmlformats.org/drawingml/2006/main" xmlns:pic="http://schemas.openxmlformats.org/drawingml/2006/picture">
             <wp:extent cx="6263640" cy="3192267"/>
-            <wp:docPr id="4" name="Picture 4" title="03-first-s3-enumeration.png" descr="Figure 4. First S3 enumeration by the compromised identity."/>
+            <wp:docPr id="6" name="Picture 6" title="05-first-s3-enumeration.png" descr="Figure 6. First S3 enumeration visible in the scoped activity timeline."/>
             <wp:cNvGraphicFramePr>
               <a:graphicFrameLocks noChangeAspect="1"/>
             </wp:cNvGraphicFramePr>
@@ -4001,11 +4186,11 @@
               <a:graphicData uri="http://schemas.openxmlformats.org/drawingml/2006/picture">
                 <pic:pic>
                   <pic:nvPicPr>
-                    <pic:cNvPr id="0" name="03-first-s3-enumeration.png"/>
+                    <pic:cNvPr id="0" name="05-first-s3-enumeration.png"/>
                     <pic:cNvPicPr/>
                   </pic:nvPicPr>
                   <pic:blipFill>
-                    <a:blip r:embed="rId14"/>
+                    <a:blip r:embed="rId16"/>
                     <a:stretch>
                       <a:fillRect/>
                     </a:stretch>
@@ -4039,7 +4224,7 @@
           <w:color w:val="5B6573"/>
           <w:sz w:val="15"/>
         </w:rPr>
-        <w:t>Figure 4. First S3 enumeration by the compromised identity.</w:t>
+        <w:t>Figure 6. First S3 enumeration visible in the scoped activity timeline.</w:t>
       </w:r>
     </w:p>
     <w:p>
@@ -4196,7 +4381,7 @@
         <w:drawing>
           <wp:inline xmlns:a="http://schemas.openxmlformats.org/drawingml/2006/main" xmlns:pic="http://schemas.openxmlformats.org/drawingml/2006/picture">
             <wp:extent cx="6263640" cy="3192267"/>
-            <wp:docPr id="5" name="Picture 5" title="04-s3-getobject-access.png" descr="Figure 5. Eight GetObject events attributed to helpdesk.luke."/>
+            <wp:docPr id="7" name="Picture 7" title="06-s3-getobject-access.png" descr="Figure 7. Eight GetObject events attributed to helpdesk.luke."/>
             <wp:cNvGraphicFramePr>
               <a:graphicFrameLocks noChangeAspect="1"/>
             </wp:cNvGraphicFramePr>
@@ -4204,11 +4389,11 @@
               <a:graphicData uri="http://schemas.openxmlformats.org/drawingml/2006/picture">
                 <pic:pic>
                   <pic:nvPicPr>
-                    <pic:cNvPr id="0" name="04-s3-getobject-access.png"/>
+                    <pic:cNvPr id="0" name="06-s3-getobject-access.png"/>
                     <pic:cNvPicPr/>
                   </pic:nvPicPr>
                   <pic:blipFill>
-                    <a:blip r:embed="rId15"/>
+                    <a:blip r:embed="rId17"/>
                     <a:stretch>
                       <a:fillRect/>
                     </a:stretch>
@@ -4242,7 +4427,7 @@
           <w:color w:val="5B6573"/>
           <w:sz w:val="15"/>
         </w:rPr>
-        <w:t>Figure 5. Eight GetObject events attributed to helpdesk.luke.</w:t>
+        <w:t>Figure 7. Eight GetObject events attributed to helpdesk.luke.</w:t>
       </w:r>
     </w:p>
     <w:p>
@@ -4326,11 +4511,6 @@
       <w:pPr>
         <w:spacing w:after="0"/>
       </w:pPr>
-    </w:p>
-    <w:p>
-      <w:r>
-        <w:br w:type="page"/>
-      </w:r>
     </w:p>
     <w:p>
       <w:pPr>
@@ -5454,6 +5634,64 @@
         <w:spacing w:after="0"/>
       </w:pPr>
     </w:p>
+    <w:p>
+      <w:pPr>
+        <w:spacing w:after="40"/>
+        <w:jc w:val="center"/>
+      </w:pPr>
+      <w:r>
+        <w:drawing>
+          <wp:inline xmlns:a="http://schemas.openxmlformats.org/drawingml/2006/main" xmlns:pic="http://schemas.openxmlformats.org/drawingml/2006/picture">
+            <wp:extent cx="6263640" cy="3192267"/>
+            <wp:docPr id="8" name="Picture 8" title="06-s3-getobject-access.png" descr="Figure 8. GetObject evidence containing Product2_CAD_Designs.dwg and its bucket."/>
+            <wp:cNvGraphicFramePr>
+              <a:graphicFrameLocks noChangeAspect="1"/>
+            </wp:cNvGraphicFramePr>
+            <a:graphic>
+              <a:graphicData uri="http://schemas.openxmlformats.org/drawingml/2006/picture">
+                <pic:pic>
+                  <pic:nvPicPr>
+                    <pic:cNvPr id="0" name="06-s3-getobject-access.png"/>
+                    <pic:cNvPicPr/>
+                  </pic:nvPicPr>
+                  <pic:blipFill>
+                    <a:blip r:embed="rId17"/>
+                    <a:stretch>
+                      <a:fillRect/>
+                    </a:stretch>
+                  </pic:blipFill>
+                  <pic:spPr>
+                    <a:xfrm>
+                      <a:off x="0" y="0"/>
+                      <a:ext cx="6263640" cy="3192267"/>
+                    </a:xfrm>
+                    <a:prstGeom prst="rect"/>
+                  </pic:spPr>
+                </pic:pic>
+              </a:graphicData>
+            </a:graphic>
+          </wp:inline>
+        </w:drawing>
+      </w:r>
+    </w:p>
+    <w:p>
+      <w:pPr>
+        <w:spacing w:after="120"/>
+        <w:jc w:val="center"/>
+        <w:keepLines/>
+        <w:widowControl/>
+      </w:pPr>
+      <w:r>
+        <w:rPr>
+          <w:rFonts w:ascii="Aptos" w:hAnsi="Aptos" w:eastAsia="Aptos"/>
+          <w:b w:val="0"/>
+          <w:i/>
+          <w:color w:val="5B6573"/>
+          <w:sz w:val="15"/>
+        </w:rPr>
+        <w:t>Figure 8. GetObject evidence containing Product2_CAD_Designs.dwg and its bucket.</w:t>
+      </w:r>
+    </w:p>
     <w:tbl>
       <w:tblPr>
         <w:tblW w:type="auto" w:w="0"/>
@@ -5673,8 +5911,8 @@
       <w:r>
         <w:drawing>
           <wp:inline xmlns:a="http://schemas.openxmlformats.org/drawingml/2006/main" xmlns:pic="http://schemas.openxmlformats.org/drawingml/2006/picture">
-            <wp:extent cx="6263640" cy="3175930"/>
-            <wp:docPr id="6" name="Picture 6" title="05-s3-public-access-change.png" descr="Figure 6. PutBucketPublicAccessBlock request with all four controls set to false."/>
+            <wp:extent cx="6263640" cy="3156351"/>
+            <wp:docPr id="9" name="Picture 9" title="07-s3-public-access-query.png" descr="Figure 9. Query result identifying the affected bucket and PutBucketPublicAccessBlock event."/>
             <wp:cNvGraphicFramePr>
               <a:graphicFrameLocks noChangeAspect="1"/>
             </wp:cNvGraphicFramePr>
@@ -5682,11 +5920,85 @@
               <a:graphicData uri="http://schemas.openxmlformats.org/drawingml/2006/picture">
                 <pic:pic>
                   <pic:nvPicPr>
-                    <pic:cNvPr id="0" name="05-s3-public-access-change.png"/>
+                    <pic:cNvPr id="0" name="07-s3-public-access-query.png"/>
                     <pic:cNvPicPr/>
                   </pic:nvPicPr>
                   <pic:blipFill>
-                    <a:blip r:embed="rId16"/>
+                    <a:blip r:embed="rId18"/>
+                    <a:stretch>
+                      <a:fillRect/>
+                    </a:stretch>
+                  </pic:blipFill>
+                  <pic:spPr>
+                    <a:xfrm>
+                      <a:off x="0" y="0"/>
+                      <a:ext cx="6263640" cy="3156351"/>
+                    </a:xfrm>
+                    <a:prstGeom prst="rect"/>
+                  </pic:spPr>
+                </pic:pic>
+              </a:graphicData>
+            </a:graphic>
+          </wp:inline>
+        </w:drawing>
+      </w:r>
+    </w:p>
+    <w:p>
+      <w:pPr>
+        <w:spacing w:after="120"/>
+        <w:jc w:val="center"/>
+        <w:keepLines/>
+        <w:widowControl/>
+      </w:pPr>
+      <w:r>
+        <w:rPr>
+          <w:rFonts w:ascii="Aptos" w:hAnsi="Aptos" w:eastAsia="Aptos"/>
+          <w:b w:val="0"/>
+          <w:i/>
+          <w:color w:val="5B6573"/>
+          <w:sz w:val="15"/>
+        </w:rPr>
+        <w:t>Figure 9. Query result identifying the affected bucket and PutBucketPublicAccessBlock event.</w:t>
+      </w:r>
+    </w:p>
+    <w:p>
+      <w:pPr>
+        <w:keepLines/>
+        <w:widowControl/>
+      </w:pPr>
+      <w:r>
+        <w:rPr>
+          <w:rFonts w:ascii="Aptos" w:hAnsi="Aptos" w:eastAsia="Aptos"/>
+          <w:b w:val="0"/>
+          <w:i w:val="0"/>
+          <w:color w:val="262626"/>
+          <w:sz w:val="19"/>
+        </w:rPr>
+        <w:t>The matching event was expanded to verify the exact request parameters rather than relying only on the API name.</w:t>
+      </w:r>
+    </w:p>
+    <w:p>
+      <w:pPr>
+        <w:spacing w:after="40"/>
+        <w:jc w:val="center"/>
+      </w:pPr>
+      <w:r>
+        <w:drawing>
+          <wp:inline xmlns:a="http://schemas.openxmlformats.org/drawingml/2006/main" xmlns:pic="http://schemas.openxmlformats.org/drawingml/2006/picture">
+            <wp:extent cx="6263640" cy="3175930"/>
+            <wp:docPr id="10" name="Picture 10" title="08-s3-public-access-details.png" descr="Figure 10. Expanded event showing all four S3 Block Public Access settings set to false."/>
+            <wp:cNvGraphicFramePr>
+              <a:graphicFrameLocks noChangeAspect="1"/>
+            </wp:cNvGraphicFramePr>
+            <a:graphic>
+              <a:graphicData uri="http://schemas.openxmlformats.org/drawingml/2006/picture">
+                <pic:pic>
+                  <pic:nvPicPr>
+                    <pic:cNvPr id="0" name="08-s3-public-access-details.png"/>
+                    <pic:cNvPicPr/>
+                  </pic:nvPicPr>
+                  <pic:blipFill>
+                    <a:blip r:embed="rId19"/>
                     <a:stretch>
                       <a:fillRect/>
                     </a:stretch>
@@ -5720,7 +6032,7 @@
           <w:color w:val="5B6573"/>
           <w:sz w:val="15"/>
         </w:rPr>
-        <w:t>Figure 6. PutBucketPublicAccessBlock request with all four controls set to false.</w:t>
+        <w:t>Figure 10. Expanded event showing all four S3 Block Public Access settings set to false.</w:t>
       </w:r>
     </w:p>
     <w:p>
@@ -6581,7 +6893,7 @@
         <w:drawing>
           <wp:inline xmlns:a="http://schemas.openxmlformats.org/drawingml/2006/main" xmlns:pic="http://schemas.openxmlformats.org/drawingml/2006/picture">
             <wp:extent cx="6263640" cy="3169395"/>
-            <wp:docPr id="7" name="Picture 7" title="06-iam-user-created.png" descr="Figure 7. Successful creation of the IAM user marketing.mark."/>
+            <wp:docPr id="11" name="Picture 11" title="09-iam-user-created.png" descr="Figure 11. Successful creation of the IAM user marketing.mark."/>
             <wp:cNvGraphicFramePr>
               <a:graphicFrameLocks noChangeAspect="1"/>
             </wp:cNvGraphicFramePr>
@@ -6589,11 +6901,11 @@
               <a:graphicData uri="http://schemas.openxmlformats.org/drawingml/2006/picture">
                 <pic:pic>
                   <pic:nvPicPr>
-                    <pic:cNvPr id="0" name="06-iam-user-created.png"/>
+                    <pic:cNvPr id="0" name="09-iam-user-created.png"/>
                     <pic:cNvPicPr/>
                   </pic:nvPicPr>
                   <pic:blipFill>
-                    <a:blip r:embed="rId17"/>
+                    <a:blip r:embed="rId20"/>
                     <a:stretch>
                       <a:fillRect/>
                     </a:stretch>
@@ -6627,7 +6939,7 @@
           <w:color w:val="5B6573"/>
           <w:sz w:val="15"/>
         </w:rPr>
-        <w:t>Figure 7. Successful creation of the IAM user marketing.mark.</w:t>
+        <w:t>Figure 11. Successful creation of the IAM user marketing.mark.</w:t>
       </w:r>
     </w:p>
     <w:p>
@@ -6882,7 +7194,7 @@
         <w:drawing>
           <wp:inline xmlns:a="http://schemas.openxmlformats.org/drawingml/2006/main" xmlns:pic="http://schemas.openxmlformats.org/drawingml/2006/picture">
             <wp:extent cx="6263640" cy="3179197"/>
-            <wp:docPr id="8" name="Picture 8" title="07-iam-user-added-to-group.png" descr="Figure 8. marketing.mark added to the Admins group."/>
+            <wp:docPr id="12" name="Picture 12" title="10-iam-user-added-to-group.png" descr="Figure 12. marketing.mark added to the Admins group."/>
             <wp:cNvGraphicFramePr>
               <a:graphicFrameLocks noChangeAspect="1"/>
             </wp:cNvGraphicFramePr>
@@ -6890,11 +7202,11 @@
               <a:graphicData uri="http://schemas.openxmlformats.org/drawingml/2006/picture">
                 <pic:pic>
                   <pic:nvPicPr>
-                    <pic:cNvPr id="0" name="07-iam-user-added-to-group.png"/>
+                    <pic:cNvPr id="0" name="10-iam-user-added-to-group.png"/>
                     <pic:cNvPicPr/>
                   </pic:nvPicPr>
                   <pic:blipFill>
-                    <a:blip r:embed="rId18"/>
+                    <a:blip r:embed="rId21"/>
                     <a:stretch>
                       <a:fillRect/>
                     </a:stretch>
@@ -6928,7 +7240,7 @@
           <w:color w:val="5B6573"/>
           <w:sz w:val="15"/>
         </w:rPr>
-        <w:t>Figure 8. marketing.mark added to the Admins group.</w:t>
+        <w:t>Figure 12. marketing.mark added to the Admins group.</w:t>
       </w:r>
     </w:p>
     <w:p>

</xml_diff>